<commit_message>
Repository Cleaning Before getting DOI: 2
</commit_message>
<xml_diff>
--- a/ms/Appendix S1.docx
+++ b/ms/Appendix S1.docx
@@ -362,7 +362,7 @@
           <v:shape id="_x0000_i1025" type="#_x0000_t75" style="width:296.25pt;height:182.25pt" o:ole="">
             <v:imagedata r:id="rId5" o:title=""/>
           </v:shape>
-          <o:OLEObject Type="Embed" ProgID="Equation.3" ShapeID="_x0000_i1025" DrawAspect="Content" ObjectID="_1810636620" r:id="rId6"/>
+          <o:OLEObject Type="Embed" ProgID="Equation.3" ShapeID="_x0000_i1025" DrawAspect="Content" ObjectID="_1814859673" r:id="rId6"/>
         </w:object>
       </w:r>
       <w:r>
@@ -855,7 +855,7 @@
           <v:shape id="_x0000_i1026" type="#_x0000_t75" style="width:207pt;height:38.25pt" o:ole="">
             <v:imagedata r:id="rId7" o:title=""/>
           </v:shape>
-          <o:OLEObject Type="Embed" ProgID="Equation.3" ShapeID="_x0000_i1026" DrawAspect="Content" ObjectID="_1810636621" r:id="rId8"/>
+          <o:OLEObject Type="Embed" ProgID="Equation.3" ShapeID="_x0000_i1026" DrawAspect="Content" ObjectID="_1814859674" r:id="rId8"/>
         </w:object>
       </w:r>
     </w:p>
@@ -2068,7 +2068,6 @@
               <w:top w:val="single" w:sz="4" w:space="0" w:color="auto"/>
               <w:bottom w:val="single" w:sz="4" w:space="0" w:color="auto"/>
             </w:tcBorders>
-            <w:shd w:val="clear" w:color="auto" w:fill="auto"/>
             <w:noWrap/>
             <w:hideMark/>
           </w:tcPr>
@@ -2100,7 +2099,6 @@
               <w:top w:val="single" w:sz="4" w:space="0" w:color="auto"/>
               <w:bottom w:val="single" w:sz="4" w:space="0" w:color="auto"/>
             </w:tcBorders>
-            <w:shd w:val="clear" w:color="auto" w:fill="auto"/>
             <w:noWrap/>
             <w:hideMark/>
           </w:tcPr>
@@ -2133,7 +2131,6 @@
               <w:top w:val="single" w:sz="4" w:space="0" w:color="auto"/>
               <w:bottom w:val="single" w:sz="4" w:space="0" w:color="auto"/>
             </w:tcBorders>
-            <w:shd w:val="clear" w:color="auto" w:fill="auto"/>
             <w:noWrap/>
             <w:hideMark/>
           </w:tcPr>
@@ -2166,7 +2163,6 @@
               <w:top w:val="single" w:sz="4" w:space="0" w:color="auto"/>
               <w:bottom w:val="single" w:sz="4" w:space="0" w:color="auto"/>
             </w:tcBorders>
-            <w:shd w:val="clear" w:color="auto" w:fill="auto"/>
             <w:noWrap/>
             <w:hideMark/>
           </w:tcPr>
@@ -2199,7 +2195,6 @@
               <w:top w:val="single" w:sz="4" w:space="0" w:color="auto"/>
               <w:bottom w:val="single" w:sz="4" w:space="0" w:color="auto"/>
             </w:tcBorders>
-            <w:shd w:val="clear" w:color="auto" w:fill="auto"/>
             <w:noWrap/>
             <w:hideMark/>
           </w:tcPr>
@@ -2232,7 +2227,6 @@
               <w:top w:val="single" w:sz="4" w:space="0" w:color="auto"/>
               <w:bottom w:val="single" w:sz="4" w:space="0" w:color="auto"/>
             </w:tcBorders>
-            <w:shd w:val="clear" w:color="auto" w:fill="auto"/>
             <w:noWrap/>
             <w:hideMark/>
           </w:tcPr>
@@ -2464,7 +2458,6 @@
           <w:tcPr>
             <w:cnfStyle w:val="001000000000" w:firstRow="0" w:lastRow="0" w:firstColumn="1" w:lastColumn="0" w:oddVBand="0" w:evenVBand="0" w:oddHBand="0" w:evenHBand="0" w:firstRowFirstColumn="0" w:firstRowLastColumn="0" w:lastRowFirstColumn="0" w:lastRowLastColumn="0"/>
             <w:tcW w:w="1890" w:type="dxa"/>
-            <w:shd w:val="clear" w:color="auto" w:fill="auto"/>
             <w:noWrap/>
             <w:hideMark/>
           </w:tcPr>
@@ -2503,7 +2496,6 @@
         <w:tc>
           <w:tcPr>
             <w:tcW w:w="1740" w:type="dxa"/>
-            <w:shd w:val="clear" w:color="auto" w:fill="auto"/>
             <w:noWrap/>
             <w:hideMark/>
           </w:tcPr>
@@ -2532,7 +2524,6 @@
         <w:tc>
           <w:tcPr>
             <w:tcW w:w="1660" w:type="dxa"/>
-            <w:shd w:val="clear" w:color="auto" w:fill="auto"/>
             <w:noWrap/>
             <w:hideMark/>
           </w:tcPr>
@@ -2560,7 +2551,6 @@
         <w:tc>
           <w:tcPr>
             <w:tcW w:w="4895" w:type="dxa"/>
-            <w:shd w:val="clear" w:color="auto" w:fill="auto"/>
             <w:noWrap/>
             <w:hideMark/>
           </w:tcPr>
@@ -2588,7 +2578,6 @@
         <w:tc>
           <w:tcPr>
             <w:tcW w:w="1228" w:type="dxa"/>
-            <w:shd w:val="clear" w:color="auto" w:fill="auto"/>
             <w:noWrap/>
             <w:hideMark/>
           </w:tcPr>
@@ -2617,7 +2606,6 @@
         <w:tc>
           <w:tcPr>
             <w:tcW w:w="3497" w:type="dxa"/>
-            <w:shd w:val="clear" w:color="auto" w:fill="auto"/>
             <w:hideMark/>
           </w:tcPr>
           <w:p>
@@ -2838,7 +2826,6 @@
           <w:tcPr>
             <w:cnfStyle w:val="001000000000" w:firstRow="0" w:lastRow="0" w:firstColumn="1" w:lastColumn="0" w:oddVBand="0" w:evenVBand="0" w:oddHBand="0" w:evenHBand="0" w:firstRowFirstColumn="0" w:firstRowLastColumn="0" w:lastRowFirstColumn="0" w:lastRowLastColumn="0"/>
             <w:tcW w:w="1890" w:type="dxa"/>
-            <w:shd w:val="clear" w:color="auto" w:fill="auto"/>
             <w:noWrap/>
             <w:hideMark/>
           </w:tcPr>
@@ -2884,7 +2871,6 @@
         <w:tc>
           <w:tcPr>
             <w:tcW w:w="1740" w:type="dxa"/>
-            <w:shd w:val="clear" w:color="auto" w:fill="auto"/>
             <w:noWrap/>
             <w:hideMark/>
           </w:tcPr>
@@ -2923,7 +2909,6 @@
         <w:tc>
           <w:tcPr>
             <w:tcW w:w="1660" w:type="dxa"/>
-            <w:shd w:val="clear" w:color="auto" w:fill="auto"/>
             <w:noWrap/>
             <w:hideMark/>
           </w:tcPr>
@@ -2951,7 +2936,6 @@
         <w:tc>
           <w:tcPr>
             <w:tcW w:w="4895" w:type="dxa"/>
-            <w:shd w:val="clear" w:color="auto" w:fill="auto"/>
             <w:noWrap/>
             <w:hideMark/>
           </w:tcPr>
@@ -2979,7 +2963,6 @@
         <w:tc>
           <w:tcPr>
             <w:tcW w:w="1228" w:type="dxa"/>
-            <w:shd w:val="clear" w:color="auto" w:fill="auto"/>
             <w:noWrap/>
             <w:hideMark/>
           </w:tcPr>
@@ -3008,7 +2991,6 @@
         <w:tc>
           <w:tcPr>
             <w:tcW w:w="3497" w:type="dxa"/>
-            <w:shd w:val="clear" w:color="auto" w:fill="auto"/>
             <w:hideMark/>
           </w:tcPr>
           <w:p>
@@ -3263,7 +3245,6 @@
           <w:tcPr>
             <w:cnfStyle w:val="001000000000" w:firstRow="0" w:lastRow="0" w:firstColumn="1" w:lastColumn="0" w:oddVBand="0" w:evenVBand="0" w:oddHBand="0" w:evenHBand="0" w:firstRowFirstColumn="0" w:firstRowLastColumn="0" w:lastRowFirstColumn="0" w:lastRowLastColumn="0"/>
             <w:tcW w:w="1890" w:type="dxa"/>
-            <w:shd w:val="clear" w:color="auto" w:fill="auto"/>
             <w:noWrap/>
             <w:hideMark/>
           </w:tcPr>
@@ -3309,7 +3290,6 @@
         <w:tc>
           <w:tcPr>
             <w:tcW w:w="1740" w:type="dxa"/>
-            <w:shd w:val="clear" w:color="auto" w:fill="auto"/>
             <w:noWrap/>
             <w:hideMark/>
           </w:tcPr>
@@ -3348,7 +3328,6 @@
         <w:tc>
           <w:tcPr>
             <w:tcW w:w="1660" w:type="dxa"/>
-            <w:shd w:val="clear" w:color="auto" w:fill="auto"/>
             <w:noWrap/>
             <w:hideMark/>
           </w:tcPr>
@@ -3376,7 +3355,6 @@
         <w:tc>
           <w:tcPr>
             <w:tcW w:w="4895" w:type="dxa"/>
-            <w:shd w:val="clear" w:color="auto" w:fill="auto"/>
             <w:noWrap/>
             <w:hideMark/>
           </w:tcPr>
@@ -3404,7 +3382,6 @@
         <w:tc>
           <w:tcPr>
             <w:tcW w:w="1228" w:type="dxa"/>
-            <w:shd w:val="clear" w:color="auto" w:fill="auto"/>
             <w:noWrap/>
             <w:hideMark/>
           </w:tcPr>
@@ -3433,7 +3410,6 @@
         <w:tc>
           <w:tcPr>
             <w:tcW w:w="3497" w:type="dxa"/>
-            <w:shd w:val="clear" w:color="auto" w:fill="auto"/>
             <w:hideMark/>
           </w:tcPr>
           <w:p>
@@ -3653,7 +3629,6 @@
           <w:tcPr>
             <w:cnfStyle w:val="001000000000" w:firstRow="0" w:lastRow="0" w:firstColumn="1" w:lastColumn="0" w:oddVBand="0" w:evenVBand="0" w:oddHBand="0" w:evenHBand="0" w:firstRowFirstColumn="0" w:firstRowLastColumn="0" w:lastRowFirstColumn="0" w:lastRowLastColumn="0"/>
             <w:tcW w:w="1890" w:type="dxa"/>
-            <w:shd w:val="clear" w:color="auto" w:fill="auto"/>
             <w:noWrap/>
             <w:hideMark/>
           </w:tcPr>
@@ -3690,7 +3665,6 @@
         <w:tc>
           <w:tcPr>
             <w:tcW w:w="1740" w:type="dxa"/>
-            <w:shd w:val="clear" w:color="auto" w:fill="auto"/>
             <w:noWrap/>
             <w:hideMark/>
           </w:tcPr>
@@ -3729,7 +3703,6 @@
         <w:tc>
           <w:tcPr>
             <w:tcW w:w="1660" w:type="dxa"/>
-            <w:shd w:val="clear" w:color="auto" w:fill="auto"/>
             <w:noWrap/>
             <w:hideMark/>
           </w:tcPr>
@@ -3757,7 +3730,6 @@
         <w:tc>
           <w:tcPr>
             <w:tcW w:w="4895" w:type="dxa"/>
-            <w:shd w:val="clear" w:color="auto" w:fill="auto"/>
             <w:noWrap/>
             <w:hideMark/>
           </w:tcPr>
@@ -3785,7 +3757,6 @@
         <w:tc>
           <w:tcPr>
             <w:tcW w:w="1228" w:type="dxa"/>
-            <w:shd w:val="clear" w:color="auto" w:fill="auto"/>
             <w:noWrap/>
             <w:hideMark/>
           </w:tcPr>
@@ -3814,7 +3785,6 @@
         <w:tc>
           <w:tcPr>
             <w:tcW w:w="3497" w:type="dxa"/>
-            <w:shd w:val="clear" w:color="auto" w:fill="auto"/>
             <w:hideMark/>
           </w:tcPr>
           <w:p>
@@ -4026,7 +3996,6 @@
           <w:tcPr>
             <w:cnfStyle w:val="001000000000" w:firstRow="0" w:lastRow="0" w:firstColumn="1" w:lastColumn="0" w:oddVBand="0" w:evenVBand="0" w:oddHBand="0" w:evenHBand="0" w:firstRowFirstColumn="0" w:firstRowLastColumn="0" w:lastRowFirstColumn="0" w:lastRowLastColumn="0"/>
             <w:tcW w:w="1890" w:type="dxa"/>
-            <w:shd w:val="clear" w:color="auto" w:fill="auto"/>
             <w:noWrap/>
             <w:hideMark/>
           </w:tcPr>
@@ -4063,7 +4032,6 @@
         <w:tc>
           <w:tcPr>
             <w:tcW w:w="1740" w:type="dxa"/>
-            <w:shd w:val="clear" w:color="auto" w:fill="auto"/>
             <w:noWrap/>
             <w:hideMark/>
           </w:tcPr>
@@ -4102,7 +4070,6 @@
         <w:tc>
           <w:tcPr>
             <w:tcW w:w="1660" w:type="dxa"/>
-            <w:shd w:val="clear" w:color="auto" w:fill="auto"/>
             <w:noWrap/>
             <w:hideMark/>
           </w:tcPr>
@@ -4130,7 +4097,6 @@
         <w:tc>
           <w:tcPr>
             <w:tcW w:w="4895" w:type="dxa"/>
-            <w:shd w:val="clear" w:color="auto" w:fill="auto"/>
             <w:noWrap/>
             <w:hideMark/>
           </w:tcPr>
@@ -4158,7 +4124,6 @@
         <w:tc>
           <w:tcPr>
             <w:tcW w:w="1228" w:type="dxa"/>
-            <w:shd w:val="clear" w:color="auto" w:fill="auto"/>
             <w:noWrap/>
             <w:hideMark/>
           </w:tcPr>
@@ -4187,7 +4152,6 @@
         <w:tc>
           <w:tcPr>
             <w:tcW w:w="3497" w:type="dxa"/>
-            <w:shd w:val="clear" w:color="auto" w:fill="auto"/>
             <w:hideMark/>
           </w:tcPr>
           <w:p>
@@ -4399,7 +4363,6 @@
           <w:tcPr>
             <w:cnfStyle w:val="001000000000" w:firstRow="0" w:lastRow="0" w:firstColumn="1" w:lastColumn="0" w:oddVBand="0" w:evenVBand="0" w:oddHBand="0" w:evenHBand="0" w:firstRowFirstColumn="0" w:firstRowLastColumn="0" w:lastRowFirstColumn="0" w:lastRowLastColumn="0"/>
             <w:tcW w:w="1890" w:type="dxa"/>
-            <w:shd w:val="clear" w:color="auto" w:fill="auto"/>
             <w:noWrap/>
             <w:hideMark/>
           </w:tcPr>
@@ -4438,7 +4401,6 @@
         <w:tc>
           <w:tcPr>
             <w:tcW w:w="1740" w:type="dxa"/>
-            <w:shd w:val="clear" w:color="auto" w:fill="auto"/>
             <w:noWrap/>
             <w:hideMark/>
           </w:tcPr>
@@ -4467,7 +4429,6 @@
         <w:tc>
           <w:tcPr>
             <w:tcW w:w="1660" w:type="dxa"/>
-            <w:shd w:val="clear" w:color="auto" w:fill="auto"/>
             <w:noWrap/>
             <w:hideMark/>
           </w:tcPr>
@@ -4495,7 +4456,6 @@
         <w:tc>
           <w:tcPr>
             <w:tcW w:w="4895" w:type="dxa"/>
-            <w:shd w:val="clear" w:color="auto" w:fill="auto"/>
             <w:hideMark/>
           </w:tcPr>
           <w:p>
@@ -4542,7 +4502,6 @@
         <w:tc>
           <w:tcPr>
             <w:tcW w:w="1228" w:type="dxa"/>
-            <w:shd w:val="clear" w:color="auto" w:fill="auto"/>
             <w:noWrap/>
             <w:hideMark/>
           </w:tcPr>
@@ -4571,7 +4530,6 @@
         <w:tc>
           <w:tcPr>
             <w:tcW w:w="3497" w:type="dxa"/>
-            <w:shd w:val="clear" w:color="auto" w:fill="auto"/>
             <w:hideMark/>
           </w:tcPr>
           <w:p>
@@ -4804,7 +4762,6 @@
           <w:tcPr>
             <w:cnfStyle w:val="001000000000" w:firstRow="0" w:lastRow="0" w:firstColumn="1" w:lastColumn="0" w:oddVBand="0" w:evenVBand="0" w:oddHBand="0" w:evenHBand="0" w:firstRowFirstColumn="0" w:firstRowLastColumn="0" w:lastRowFirstColumn="0" w:lastRowLastColumn="0"/>
             <w:tcW w:w="1890" w:type="dxa"/>
-            <w:shd w:val="clear" w:color="auto" w:fill="auto"/>
             <w:noWrap/>
             <w:hideMark/>
           </w:tcPr>
@@ -4831,7 +4788,6 @@
         <w:tc>
           <w:tcPr>
             <w:tcW w:w="1740" w:type="dxa"/>
-            <w:shd w:val="clear" w:color="auto" w:fill="auto"/>
             <w:noWrap/>
             <w:hideMark/>
           </w:tcPr>
@@ -4860,7 +4816,6 @@
         <w:tc>
           <w:tcPr>
             <w:tcW w:w="1660" w:type="dxa"/>
-            <w:shd w:val="clear" w:color="auto" w:fill="auto"/>
             <w:noWrap/>
             <w:hideMark/>
           </w:tcPr>
@@ -4888,7 +4843,6 @@
         <w:tc>
           <w:tcPr>
             <w:tcW w:w="4895" w:type="dxa"/>
-            <w:shd w:val="clear" w:color="auto" w:fill="auto"/>
             <w:hideMark/>
           </w:tcPr>
           <w:p>
@@ -4935,7 +4889,6 @@
         <w:tc>
           <w:tcPr>
             <w:tcW w:w="1228" w:type="dxa"/>
-            <w:shd w:val="clear" w:color="auto" w:fill="auto"/>
             <w:noWrap/>
             <w:hideMark/>
           </w:tcPr>
@@ -4964,7 +4917,6 @@
         <w:tc>
           <w:tcPr>
             <w:tcW w:w="3497" w:type="dxa"/>
-            <w:shd w:val="clear" w:color="auto" w:fill="auto"/>
             <w:hideMark/>
           </w:tcPr>
           <w:p>
@@ -5163,7 +5115,6 @@
           <w:tcPr>
             <w:cnfStyle w:val="001000000000" w:firstRow="0" w:lastRow="0" w:firstColumn="1" w:lastColumn="0" w:oddVBand="0" w:evenVBand="0" w:oddHBand="0" w:evenHBand="0" w:firstRowFirstColumn="0" w:firstRowLastColumn="0" w:lastRowFirstColumn="0" w:lastRowLastColumn="0"/>
             <w:tcW w:w="1890" w:type="dxa"/>
-            <w:shd w:val="clear" w:color="auto" w:fill="auto"/>
             <w:noWrap/>
             <w:hideMark/>
           </w:tcPr>
@@ -5211,7 +5162,6 @@
         <w:tc>
           <w:tcPr>
             <w:tcW w:w="1740" w:type="dxa"/>
-            <w:shd w:val="clear" w:color="auto" w:fill="auto"/>
             <w:noWrap/>
             <w:hideMark/>
           </w:tcPr>
@@ -5240,7 +5190,6 @@
         <w:tc>
           <w:tcPr>
             <w:tcW w:w="1660" w:type="dxa"/>
-            <w:shd w:val="clear" w:color="auto" w:fill="auto"/>
             <w:noWrap/>
             <w:hideMark/>
           </w:tcPr>
@@ -5268,7 +5217,6 @@
         <w:tc>
           <w:tcPr>
             <w:tcW w:w="4895" w:type="dxa"/>
-            <w:shd w:val="clear" w:color="auto" w:fill="auto"/>
             <w:hideMark/>
           </w:tcPr>
           <w:p>
@@ -5295,7 +5243,6 @@
         <w:tc>
           <w:tcPr>
             <w:tcW w:w="1228" w:type="dxa"/>
-            <w:shd w:val="clear" w:color="auto" w:fill="auto"/>
             <w:noWrap/>
             <w:hideMark/>
           </w:tcPr>
@@ -5324,7 +5271,6 @@
         <w:tc>
           <w:tcPr>
             <w:tcW w:w="3497" w:type="dxa"/>
-            <w:shd w:val="clear" w:color="auto" w:fill="auto"/>
             <w:hideMark/>
           </w:tcPr>
           <w:p>
@@ -5536,7 +5482,6 @@
           <w:tcPr>
             <w:cnfStyle w:val="001000000000" w:firstRow="0" w:lastRow="0" w:firstColumn="1" w:lastColumn="0" w:oddVBand="0" w:evenVBand="0" w:oddHBand="0" w:evenHBand="0" w:firstRowFirstColumn="0" w:firstRowLastColumn="0" w:lastRowFirstColumn="0" w:lastRowLastColumn="0"/>
             <w:tcW w:w="1890" w:type="dxa"/>
-            <w:shd w:val="clear" w:color="auto" w:fill="auto"/>
             <w:noWrap/>
             <w:hideMark/>
           </w:tcPr>
@@ -5575,7 +5520,6 @@
         <w:tc>
           <w:tcPr>
             <w:tcW w:w="1740" w:type="dxa"/>
-            <w:shd w:val="clear" w:color="auto" w:fill="auto"/>
             <w:noWrap/>
             <w:hideMark/>
           </w:tcPr>
@@ -5604,7 +5548,6 @@
         <w:tc>
           <w:tcPr>
             <w:tcW w:w="1660" w:type="dxa"/>
-            <w:shd w:val="clear" w:color="auto" w:fill="auto"/>
             <w:noWrap/>
             <w:hideMark/>
           </w:tcPr>
@@ -5632,7 +5575,6 @@
         <w:tc>
           <w:tcPr>
             <w:tcW w:w="4895" w:type="dxa"/>
-            <w:shd w:val="clear" w:color="auto" w:fill="auto"/>
             <w:hideMark/>
           </w:tcPr>
           <w:p>
@@ -5659,7 +5601,6 @@
         <w:tc>
           <w:tcPr>
             <w:tcW w:w="1228" w:type="dxa"/>
-            <w:shd w:val="clear" w:color="auto" w:fill="auto"/>
             <w:noWrap/>
             <w:hideMark/>
           </w:tcPr>
@@ -5688,7 +5629,6 @@
         <w:tc>
           <w:tcPr>
             <w:tcW w:w="3497" w:type="dxa"/>
-            <w:shd w:val="clear" w:color="auto" w:fill="auto"/>
             <w:hideMark/>
           </w:tcPr>
           <w:p>
@@ -5891,7 +5831,6 @@
           <w:tcPr>
             <w:cnfStyle w:val="001000000000" w:firstRow="0" w:lastRow="0" w:firstColumn="1" w:lastColumn="0" w:oddVBand="0" w:evenVBand="0" w:oddHBand="0" w:evenHBand="0" w:firstRowFirstColumn="0" w:firstRowLastColumn="0" w:lastRowFirstColumn="0" w:lastRowLastColumn="0"/>
             <w:tcW w:w="1890" w:type="dxa"/>
-            <w:shd w:val="clear" w:color="auto" w:fill="auto"/>
             <w:noWrap/>
             <w:hideMark/>
           </w:tcPr>
@@ -5930,7 +5869,6 @@
         <w:tc>
           <w:tcPr>
             <w:tcW w:w="1740" w:type="dxa"/>
-            <w:shd w:val="clear" w:color="auto" w:fill="auto"/>
             <w:noWrap/>
             <w:hideMark/>
           </w:tcPr>
@@ -5959,7 +5897,6 @@
         <w:tc>
           <w:tcPr>
             <w:tcW w:w="1660" w:type="dxa"/>
-            <w:shd w:val="clear" w:color="auto" w:fill="auto"/>
             <w:noWrap/>
             <w:hideMark/>
           </w:tcPr>
@@ -5987,7 +5924,6 @@
         <w:tc>
           <w:tcPr>
             <w:tcW w:w="4895" w:type="dxa"/>
-            <w:shd w:val="clear" w:color="auto" w:fill="auto"/>
             <w:hideMark/>
           </w:tcPr>
           <w:p>
@@ -6014,7 +5950,6 @@
         <w:tc>
           <w:tcPr>
             <w:tcW w:w="1228" w:type="dxa"/>
-            <w:shd w:val="clear" w:color="auto" w:fill="auto"/>
             <w:noWrap/>
             <w:hideMark/>
           </w:tcPr>
@@ -6043,7 +5978,6 @@
         <w:tc>
           <w:tcPr>
             <w:tcW w:w="3497" w:type="dxa"/>
-            <w:shd w:val="clear" w:color="auto" w:fill="auto"/>
             <w:hideMark/>
           </w:tcPr>
           <w:p>
@@ -6268,7 +6202,6 @@
           <w:tcPr>
             <w:cnfStyle w:val="001000000000" w:firstRow="0" w:lastRow="0" w:firstColumn="1" w:lastColumn="0" w:oddVBand="0" w:evenVBand="0" w:oddHBand="0" w:evenHBand="0" w:firstRowFirstColumn="0" w:firstRowLastColumn="0" w:lastRowFirstColumn="0" w:lastRowLastColumn="0"/>
             <w:tcW w:w="1890" w:type="dxa"/>
-            <w:shd w:val="clear" w:color="auto" w:fill="auto"/>
             <w:noWrap/>
             <w:hideMark/>
           </w:tcPr>
@@ -6295,7 +6228,6 @@
         <w:tc>
           <w:tcPr>
             <w:tcW w:w="1740" w:type="dxa"/>
-            <w:shd w:val="clear" w:color="auto" w:fill="auto"/>
             <w:noWrap/>
             <w:hideMark/>
           </w:tcPr>
@@ -6324,7 +6256,6 @@
         <w:tc>
           <w:tcPr>
             <w:tcW w:w="1660" w:type="dxa"/>
-            <w:shd w:val="clear" w:color="auto" w:fill="auto"/>
             <w:noWrap/>
             <w:hideMark/>
           </w:tcPr>
@@ -6352,7 +6283,6 @@
         <w:tc>
           <w:tcPr>
             <w:tcW w:w="4895" w:type="dxa"/>
-            <w:shd w:val="clear" w:color="auto" w:fill="auto"/>
             <w:noWrap/>
             <w:hideMark/>
           </w:tcPr>
@@ -6391,7 +6321,6 @@
         <w:tc>
           <w:tcPr>
             <w:tcW w:w="1228" w:type="dxa"/>
-            <w:shd w:val="clear" w:color="auto" w:fill="auto"/>
             <w:noWrap/>
             <w:hideMark/>
           </w:tcPr>
@@ -6420,7 +6349,6 @@
         <w:tc>
           <w:tcPr>
             <w:tcW w:w="3497" w:type="dxa"/>
-            <w:shd w:val="clear" w:color="auto" w:fill="auto"/>
             <w:hideMark/>
           </w:tcPr>
           <w:p>
@@ -6611,7 +6539,6 @@
           <w:tcPr>
             <w:cnfStyle w:val="001000000000" w:firstRow="0" w:lastRow="0" w:firstColumn="1" w:lastColumn="0" w:oddVBand="0" w:evenVBand="0" w:oddHBand="0" w:evenHBand="0" w:firstRowFirstColumn="0" w:firstRowLastColumn="0" w:lastRowFirstColumn="0" w:lastRowLastColumn="0"/>
             <w:tcW w:w="1890" w:type="dxa"/>
-            <w:shd w:val="clear" w:color="auto" w:fill="auto"/>
             <w:noWrap/>
             <w:hideMark/>
           </w:tcPr>
@@ -6638,7 +6565,6 @@
         <w:tc>
           <w:tcPr>
             <w:tcW w:w="1740" w:type="dxa"/>
-            <w:shd w:val="clear" w:color="auto" w:fill="auto"/>
             <w:noWrap/>
             <w:hideMark/>
           </w:tcPr>
@@ -6667,7 +6593,6 @@
         <w:tc>
           <w:tcPr>
             <w:tcW w:w="1660" w:type="dxa"/>
-            <w:shd w:val="clear" w:color="auto" w:fill="auto"/>
             <w:noWrap/>
             <w:hideMark/>
           </w:tcPr>
@@ -6695,7 +6620,6 @@
         <w:tc>
           <w:tcPr>
             <w:tcW w:w="4895" w:type="dxa"/>
-            <w:shd w:val="clear" w:color="auto" w:fill="auto"/>
             <w:hideMark/>
           </w:tcPr>
           <w:p>
@@ -6722,7 +6646,6 @@
         <w:tc>
           <w:tcPr>
             <w:tcW w:w="1228" w:type="dxa"/>
-            <w:shd w:val="clear" w:color="auto" w:fill="auto"/>
             <w:noWrap/>
             <w:hideMark/>
           </w:tcPr>
@@ -6751,7 +6674,6 @@
         <w:tc>
           <w:tcPr>
             <w:tcW w:w="3497" w:type="dxa"/>
-            <w:shd w:val="clear" w:color="auto" w:fill="auto"/>
             <w:hideMark/>
           </w:tcPr>
           <w:p>
@@ -6942,7 +6864,6 @@
           <w:tcPr>
             <w:cnfStyle w:val="001000000000" w:firstRow="0" w:lastRow="0" w:firstColumn="1" w:lastColumn="0" w:oddVBand="0" w:evenVBand="0" w:oddHBand="0" w:evenHBand="0" w:firstRowFirstColumn="0" w:firstRowLastColumn="0" w:lastRowFirstColumn="0" w:lastRowLastColumn="0"/>
             <w:tcW w:w="1890" w:type="dxa"/>
-            <w:shd w:val="clear" w:color="auto" w:fill="auto"/>
             <w:noWrap/>
             <w:hideMark/>
           </w:tcPr>
@@ -6969,7 +6890,6 @@
         <w:tc>
           <w:tcPr>
             <w:tcW w:w="1740" w:type="dxa"/>
-            <w:shd w:val="clear" w:color="auto" w:fill="auto"/>
             <w:noWrap/>
             <w:hideMark/>
           </w:tcPr>
@@ -6998,7 +6918,6 @@
         <w:tc>
           <w:tcPr>
             <w:tcW w:w="1660" w:type="dxa"/>
-            <w:shd w:val="clear" w:color="auto" w:fill="auto"/>
             <w:noWrap/>
             <w:hideMark/>
           </w:tcPr>
@@ -7026,7 +6945,6 @@
         <w:tc>
           <w:tcPr>
             <w:tcW w:w="4895" w:type="dxa"/>
-            <w:shd w:val="clear" w:color="auto" w:fill="auto"/>
             <w:hideMark/>
           </w:tcPr>
           <w:p>
@@ -7053,7 +6971,6 @@
         <w:tc>
           <w:tcPr>
             <w:tcW w:w="1228" w:type="dxa"/>
-            <w:shd w:val="clear" w:color="auto" w:fill="auto"/>
             <w:noWrap/>
             <w:hideMark/>
           </w:tcPr>
@@ -7082,7 +6999,6 @@
         <w:tc>
           <w:tcPr>
             <w:tcW w:w="3497" w:type="dxa"/>
-            <w:shd w:val="clear" w:color="auto" w:fill="auto"/>
             <w:hideMark/>
           </w:tcPr>
           <w:p>
@@ -7343,9 +7259,120 @@
       <w:r>
         <w:rPr>
           <w:noProof/>
+        </w:rPr>
+        <w:lastRenderedPageBreak/>
+        <mc:AlternateContent>
+          <mc:Choice Requires="wps">
+            <w:drawing>
+              <wp:anchor distT="45720" distB="45720" distL="114300" distR="114300" simplePos="0" relativeHeight="251661312" behindDoc="0" locked="0" layoutInCell="1" allowOverlap="1" wp14:anchorId="7A47907A" wp14:editId="741A7182">
+                <wp:simplePos x="0" y="0"/>
+                <wp:positionH relativeFrom="column">
+                  <wp:posOffset>2895600</wp:posOffset>
+                </wp:positionH>
+                <wp:positionV relativeFrom="paragraph">
+                  <wp:posOffset>933450</wp:posOffset>
+                </wp:positionV>
+                <wp:extent cx="609600" cy="400050"/>
+                <wp:effectExtent l="0" t="0" r="0" b="0"/>
+                <wp:wrapNone/>
+                <wp:docPr id="217" name="Text Box 2"/>
+                <wp:cNvGraphicFramePr>
+                  <a:graphicFrameLocks xmlns:a="http://schemas.openxmlformats.org/drawingml/2006/main"/>
+                </wp:cNvGraphicFramePr>
+                <a:graphic xmlns:a="http://schemas.openxmlformats.org/drawingml/2006/main">
+                  <a:graphicData uri="http://schemas.microsoft.com/office/word/2010/wordprocessingShape">
+                    <wps:wsp>
+                      <wps:cNvSpPr txBox="1">
+                        <a:spLocks noChangeArrowheads="1"/>
+                      </wps:cNvSpPr>
+                      <wps:spPr bwMode="auto">
+                        <a:xfrm>
+                          <a:off x="0" y="0"/>
+                          <a:ext cx="609600" cy="400050"/>
+                        </a:xfrm>
+                        <a:prstGeom prst="rect">
+                          <a:avLst/>
+                        </a:prstGeom>
+                        <a:solidFill>
+                          <a:schemeClr val="bg1"/>
+                        </a:solidFill>
+                        <a:ln w="9525">
+                          <a:noFill/>
+                          <a:miter lim="800000"/>
+                          <a:headEnd/>
+                          <a:tailEnd/>
+                        </a:ln>
+                      </wps:spPr>
+                      <wps:txbx>
+                        <w:txbxContent>
+                          <w:p>
+                            <w:pPr>
+                              <w:rPr>
+                                <w:sz w:val="12"/>
+                                <w:szCs w:val="12"/>
+                              </w:rPr>
+                            </w:pPr>
+                            <w:r>
+                              <w:rPr>
+                                <w:sz w:val="12"/>
+                                <w:szCs w:val="12"/>
+                              </w:rPr>
+                              <w:t>Juvenile Survival (&lt; 10 mm SL)</w:t>
+                            </w:r>
+                          </w:p>
+                        </w:txbxContent>
+                      </wps:txbx>
+                      <wps:bodyPr rot="0" vert="horz" wrap="square" lIns="91440" tIns="45720" rIns="91440" bIns="45720" anchor="t" anchorCtr="0">
+                        <a:noAutofit/>
+                      </wps:bodyPr>
+                    </wps:wsp>
+                  </a:graphicData>
+                </a:graphic>
+                <wp14:sizeRelH relativeFrom="margin">
+                  <wp14:pctWidth>0</wp14:pctWidth>
+                </wp14:sizeRelH>
+                <wp14:sizeRelV relativeFrom="margin">
+                  <wp14:pctHeight>0</wp14:pctHeight>
+                </wp14:sizeRelV>
+              </wp:anchor>
+            </w:drawing>
+          </mc:Choice>
+          <mc:Fallback>
+            <w:pict>
+              <v:shapetype w14:anchorId="7A47907A" id="_x0000_t202" coordsize="21600,21600" o:spt="202" path="m,l,21600r21600,l21600,xe">
+                <v:stroke joinstyle="miter"/>
+                <v:path gradientshapeok="t" o:connecttype="rect"/>
+              </v:shapetype>
+              <v:shape id="Text Box 2" o:spid="_x0000_s1026" type="#_x0000_t202" style="position:absolute;left:0;text-align:left;margin-left:228pt;margin-top:73.5pt;width:48pt;height:31.5pt;z-index:251661312;visibility:visible;mso-wrap-style:square;mso-width-percent:0;mso-height-percent:0;mso-wrap-distance-left:9pt;mso-wrap-distance-top:3.6pt;mso-wrap-distance-right:9pt;mso-wrap-distance-bottom:3.6pt;mso-position-horizontal:absolute;mso-position-horizontal-relative:text;mso-position-vertical:absolute;mso-position-vertical-relative:text;mso-width-percent:0;mso-height-percent:0;mso-width-relative:margin;mso-height-relative:margin;v-text-anchor:top" o:gfxdata="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" fillcolor="white [3212]" stroked="f">
+                <v:textbox>
+                  <w:txbxContent>
+                    <w:p>
+                      <w:pPr>
+                        <w:rPr>
+                          <w:sz w:val="12"/>
+                          <w:szCs w:val="12"/>
+                        </w:rPr>
+                      </w:pPr>
+                      <w:r>
+                        <w:rPr>
+                          <w:sz w:val="12"/>
+                          <w:szCs w:val="12"/>
+                        </w:rPr>
+                        <w:t>Juvenile Survival (&lt; 10 mm SL)</w:t>
+                      </w:r>
+                    </w:p>
+                  </w:txbxContent>
+                </v:textbox>
+              </v:shape>
+            </w:pict>
+          </mc:Fallback>
+        </mc:AlternateContent>
+      </w:r>
+      <w:r>
+        <w:rPr>
+          <w:noProof/>
           <w14:ligatures w14:val="standardContextual"/>
         </w:rPr>
-        <w:lastRenderedPageBreak/>
         <mc:AlternateContent>
           <mc:Choice Requires="wps">
             <w:drawing>
@@ -7507,7 +7534,13 @@
       </w:r>
       <w:proofErr w:type="spellEnd"/>
       <w:r>
-        <w:t xml:space="preserve"> and Cumulative Juvenile Survival (CJS) from all simulations. The dashed line indicates an r = 0 which means populations are at replacement (i.e., not increasing nor declining).</w:t>
+        <w:t xml:space="preserve"> and </w:t>
+      </w:r>
+      <w:r>
+        <w:t>juvenile survival snails &lt; 10 mm SL</w:t>
+      </w:r>
+      <w:r>
+        <w:t xml:space="preserve"> (CJS) from all simulations. The dashed line indicates an r = 0 which means populations are at replacement (i.e., not increasing nor declining).</w:t>
       </w:r>
     </w:p>
     <w:p>

</xml_diff>